<commit_message>
Add v3 clean-dataset A/B results + Modelfile.v3
v3 rebuilt the SFT dataset with sentence/word-boundary truncation (no mid-word cuts) + first-sentence mitigation blurbs, fixing v2's garbling. base-vs-v3 (20 samples, Haiku judge): Faithfulness 0.243->0.587, Answer Correctness 0.351->0.310, Token F1 0.131->0.199, BERTScore 0.826->0.851. v3 fixes v2 but is on par with v1 (longer answers did not lift Answer Correctness). Adds export/Modelfile.v3 and the v3 results section (9.5) in FINETUNE_REPORT (.md/.docx/.pdf).

Co-Authored-By: Claude Opus 4.8 <noreply@anthropic.com>
</commit_message>
<xml_diff>
--- a/rag_service/finetune/docs/FINETUNE_REPORT.docx
+++ b/rag_service/finetune/docs/FINETUNE_REPORT.docx
@@ -4073,7 +4073,7 @@
     </w:p>
     <w:bookmarkEnd w:id="29"/>
     <w:bookmarkEnd w:id="30"/>
-    <w:bookmarkStart w:id="35" w:name="evaluation-comparison-methodology"/>
+    <w:bookmarkStart w:id="36" w:name="evaluation-comparison-methodology"/>
     <w:p>
       <w:pPr>
         <w:pStyle w:val="Heading1"/>
@@ -5104,158 +5104,28 @@
         <w:t xml:space="preserve">agree on the overall direction.</w:t>
       </w:r>
     </w:p>
-    <w:p>
-      <w:r>
-        <w:pict>
-          <v:rect style="width:0;height:1.5pt" o:hralign="center" o:hrstd="t" o:hr="t"/>
-        </w:pict>
-      </w:r>
-    </w:p>
     <w:bookmarkEnd w:id="34"/>
-    <w:bookmarkEnd w:id="35"/>
-    <w:bookmarkStart w:id="36" w:name="end-to-end-workflow"/>
-    <w:p>
-      <w:pPr>
-        <w:pStyle w:val="Heading1"/>
-      </w:pPr>
-      <w:r>
-        <w:t xml:space="preserve">10. End-to-End Workflow</w:t>
-      </w:r>
-    </w:p>
-    <w:p>
-      <w:pPr>
-        <w:pStyle w:val="SourceCode"/>
-      </w:pPr>
-      <w:r>
-        <w:rPr>
-          <w:rStyle w:val="VerbatimChar"/>
-        </w:rPr>
-        <w:t xml:space="preserve">[1] Build dataset (dev box)</w:t>
-      </w:r>
-      <w:r>
-        <w:br/>
-      </w:r>
-      <w:r>
-        <w:rPr>
-          <w:rStyle w:val="VerbatimChar"/>
-        </w:rPr>
-        <w:t xml:space="preserve">    python data/build_dataset.py --max-per-category 600</w:t>
-      </w:r>
-      <w:r>
-        <w:br/>
-      </w:r>
-      <w:r>
-        <w:rPr>
-          <w:rStyle w:val="VerbatimChar"/>
-        </w:rPr>
-        <w:t xml:space="preserve">        -&gt; data/output/train.jsonl, val.jsonl</w:t>
-      </w:r>
-      <w:r>
-        <w:br/>
-      </w:r>
-      <w:r>
-        <w:br/>
-      </w:r>
-      <w:r>
-        <w:rPr>
-          <w:rStyle w:val="VerbatimChar"/>
-        </w:rPr>
-        <w:t xml:space="preserve">[2] Train (Cloud GPU — Colab/Kaggle T4)</w:t>
-      </w:r>
-      <w:r>
-        <w:br/>
-      </w:r>
-      <w:r>
-        <w:rPr>
-          <w:rStyle w:val="VerbatimChar"/>
-        </w:rPr>
-        <w:t xml:space="preserve">    open train/Finetune_Colab.ipynb  (or: python train/train_unsloth.py --gguf)</w:t>
-      </w:r>
-      <w:r>
-        <w:br/>
-      </w:r>
-      <w:r>
-        <w:rPr>
-          <w:rStyle w:val="VerbatimChar"/>
-        </w:rPr>
-        <w:t xml:space="preserve">        -&gt; LoRA adapter (+ GGUF Q4_K_M)</w:t>
-      </w:r>
-      <w:r>
-        <w:br/>
-      </w:r>
-      <w:r>
-        <w:br/>
-      </w:r>
-      <w:r>
-        <w:rPr>
-          <w:rStyle w:val="VerbatimChar"/>
-        </w:rPr>
-        <w:t xml:space="preserve">[3] Export + register (dev box)</w:t>
-      </w:r>
-      <w:r>
-        <w:br/>
-      </w:r>
-      <w:r>
-        <w:rPr>
-          <w:rStyle w:val="VerbatimChar"/>
-        </w:rPr>
-        <w:t xml:space="preserve">    ollama create mitre-qwen:7b -f export/Modelfile</w:t>
-      </w:r>
-      <w:r>
-        <w:br/>
-      </w:r>
-      <w:r>
-        <w:rPr>
-          <w:rStyle w:val="VerbatimChar"/>
-        </w:rPr>
-        <w:t xml:space="preserve">        -&gt; Ollama now has qwen2.5:7b AND mitre-qwen:7b</w:t>
-      </w:r>
-      <w:r>
-        <w:br/>
-      </w:r>
-      <w:r>
-        <w:br/>
-      </w:r>
-      <w:r>
-        <w:rPr>
-          <w:rStyle w:val="VerbatimChar"/>
-        </w:rPr>
-        <w:t xml:space="preserve">[4] Compare (dev box, DBs up)</w:t>
-      </w:r>
-      <w:r>
-        <w:br/>
-      </w:r>
-      <w:r>
-        <w:rPr>
-          <w:rStyle w:val="VerbatimChar"/>
-        </w:rPr>
-        <w:t xml:space="preserve">    python compare/run_comparison.py --max-samples 20</w:t>
-      </w:r>
-      <w:r>
-        <w:br/>
-      </w:r>
-      <w:r>
-        <w:rPr>
-          <w:rStyle w:val="VerbatimChar"/>
-        </w:rPr>
-        <w:t xml:space="preserve">        -&gt; compare/comparison_&lt;dataset&gt;.md  (side-by-side metrics)</w:t>
-      </w:r>
-    </w:p>
-    <w:p>
-      <w:r>
-        <w:pict>
-          <v:rect style="width:0;height:1.5pt" o:hralign="center" o:hrstd="t" o:hr="t"/>
-        </w:pict>
-      </w:r>
-    </w:p>
-    <w:bookmarkEnd w:id="36"/>
-    <w:bookmarkStart w:id="37" w:name="reproducibility"/>
-    <w:p>
-      <w:pPr>
-        <w:pStyle w:val="Heading1"/>
-      </w:pPr>
-      <w:r>
-        <w:t xml:space="preserve">11. Reproducibility</w:t>
+    <w:bookmarkStart w:id="35" w:name="follow-up-retrains-v2-degraded-v3-clean"/>
+    <w:p>
+      <w:pPr>
+        <w:pStyle w:val="Heading2"/>
+      </w:pPr>
+      <w:r>
+        <w:t xml:space="preserve">9.5 Follow-up retrains (v2 degraded, v3 clean)</w:t>
+      </w:r>
+    </w:p>
+    <w:p>
+      <w:pPr>
+        <w:pStyle w:val="FirstParagraph"/>
+      </w:pPr>
+      <w:r>
+        <w:t xml:space="preserve">Two dataset iterations were attempted to lift Answer Correctness — the one metric</w:t>
+      </w:r>
+      <w:r>
+        <w:t xml:space="preserve"> </w:t>
+      </w:r>
+      <w:r>
+        <w:t xml:space="preserve">where the specialist regresses against base:</w:t>
       </w:r>
     </w:p>
     <w:p>
@@ -5271,13 +5141,66 @@
           <w:b/>
           <w:bCs/>
         </w:rPr>
-        <w:t xml:space="preserve">Seed</w:t>
-      </w:r>
-      <w:r>
-        <w:t xml:space="preserve"> </w:t>
-      </w:r>
-      <w:r>
-        <w:t xml:space="preserve">42 used for dataset shuffling/splitting and training.</w:t>
+        <w:t xml:space="preserve">v2</w:t>
+      </w:r>
+      <w:r>
+        <w:t xml:space="preserve"> </w:t>
+      </w:r>
+      <w:r>
+        <w:t xml:space="preserve">added a compound</w:t>
+      </w:r>
+      <w:r>
+        <w:t xml:space="preserve"> </w:t>
+      </w:r>
+      <w:r>
+        <w:rPr>
+          <w:rStyle w:val="VerbatimChar"/>
+        </w:rPr>
+        <w:t xml:space="preserve">technique_profile</w:t>
+      </w:r>
+      <w:r>
+        <w:t xml:space="preserve"> </w:t>
+      </w:r>
+      <w:r>
+        <w:t xml:space="preserve">template plus longer answers. It</w:t>
+      </w:r>
+      <w:r>
+        <w:t xml:space="preserve"> </w:t>
+      </w:r>
+      <w:r>
+        <w:rPr>
+          <w:b/>
+          <w:bCs/>
+        </w:rPr>
+        <w:t xml:space="preserve">degraded</w:t>
+      </w:r>
+      <w:r>
+        <w:t xml:space="preserve"> </w:t>
+      </w:r>
+      <w:r>
+        <w:t xml:space="preserve">the model: fluent but hallucinated output, fabricated IDs, mid-word</w:t>
+      </w:r>
+      <w:r>
+        <w:t xml:space="preserve"> </w:t>
+      </w:r>
+      <w:r>
+        <w:t xml:space="preserve">fragments. Root cause was the dataset builder truncating descriptions</w:t>
+      </w:r>
+      <w:r>
+        <w:t xml:space="preserve"> </w:t>
+      </w:r>
+      <w:r>
+        <w:rPr>
+          <w:b/>
+          <w:bCs/>
+        </w:rPr>
+        <w:t xml:space="preserve">mid-word</w:t>
+      </w:r>
+      <w:r>
+        <w:t xml:space="preserve"> </w:t>
+      </w:r>
+      <w:r>
+        <w:t xml:space="preserve">(and over-long answers drifting), which the model faithfully learned. v2 is unused.</w:t>
       </w:r>
     </w:p>
     <w:p>
@@ -5289,7 +5212,47 @@
         </w:numPr>
       </w:pPr>
       <w:r>
-        <w:t xml:space="preserve">All hyper-parameters are centralised in</w:t>
+        <w:rPr>
+          <w:b/>
+          <w:bCs/>
+        </w:rPr>
+        <w:t xml:space="preserve">v3</w:t>
+      </w:r>
+      <w:r>
+        <w:t xml:space="preserve"> </w:t>
+      </w:r>
+      <w:r>
+        <w:t xml:space="preserve">rebuilt the dataset with clean truncation (sentence/word boundaries only,</w:t>
+      </w:r>
+      <w:r>
+        <w:t xml:space="preserve"> </w:t>
+      </w:r>
+      <w:r>
+        <w:t xml:space="preserve">first-sentence per-mitigation blurbs, dangling-citation cleanup). This</w:t>
+      </w:r>
+      <w:r>
+        <w:t xml:space="preserve"> </w:t>
+      </w:r>
+      <w:r>
+        <w:rPr>
+          <w:b/>
+          <w:bCs/>
+        </w:rPr>
+        <w:t xml:space="preserve">fixed</w:t>
+      </w:r>
+      <w:r>
+        <w:t xml:space="preserve"> </w:t>
+      </w:r>
+      <w:r>
+        <w:t xml:space="preserve">the v2 degradation — v3 answers are accurate and well-formed again.</w:t>
+      </w:r>
+    </w:p>
+    <w:p>
+      <w:pPr>
+        <w:pStyle w:val="FirstParagraph"/>
+      </w:pPr>
+      <w:r>
+        <w:t xml:space="preserve">v3 was scored on the same 20-sample</w:t>
       </w:r>
       <w:r>
         <w:t xml:space="preserve"> </w:t>
@@ -5298,10 +5261,647 @@
         <w:rPr>
           <w:rStyle w:val="VerbatimChar"/>
         </w:rPr>
-        <w:t xml:space="preserve">ft_config.py</w:t>
-      </w:r>
-      <w:r>
-        <w:t xml:space="preserve">.</w:t>
+        <w:t xml:space="preserve">eval_dataset.json</w:t>
+      </w:r>
+      <w:r>
+        <w:t xml:space="preserve">, same retrieval</w:t>
+      </w:r>
+      <w:r>
+        <w:t xml:space="preserve"> </w:t>
+      </w:r>
+      <w:r>
+        <w:t xml:space="preserve">(bge-reranker-v2-m3) and Haiku judge. The base column is reused from the identical</w:t>
+      </w:r>
+      <w:r>
+        <w:t xml:space="preserve"> </w:t>
+      </w:r>
+      <w:r>
+        <w:t xml:space="preserve">v1 run (same model / dataset / retriever / judge); v3 was scored on its own because</w:t>
+      </w:r>
+      <w:r>
+        <w:t xml:space="preserve"> </w:t>
+      </w:r>
+      <w:r>
+        <w:t xml:space="preserve">the base model’s long answers exhaust the 16 GB dev box during a paired run.</w:t>
+      </w:r>
+    </w:p>
+    <w:tbl>
+      <w:tblPr>
+        <w:tblStyle w:val="Table"/>
+        <w:tblW w:type="auto" w:w="0"/>
+        <w:tblLook w:firstRow="1" w:lastRow="0" w:firstColumn="0" w:lastColumn="0" w:noHBand="0" w:noVBand="0" w:val="0020"/>
+      </w:tblPr>
+      <w:tblGrid>
+        <w:gridCol w:w="1980"/>
+        <w:gridCol w:w="1980"/>
+        <w:gridCol w:w="1980"/>
+        <w:gridCol w:w="1980"/>
+      </w:tblGrid>
+      <w:tr>
+        <w:trPr>
+          <w:tblHeader w:val="on"/>
+        </w:trPr>
+        <w:tc>
+          <w:tcPr/>
+          <w:p>
+            <w:pPr>
+              <w:pStyle w:val="Compact"/>
+            </w:pPr>
+            <w:r>
+              <w:t xml:space="preserve">Metric</w:t>
+            </w:r>
+          </w:p>
+        </w:tc>
+        <w:tc>
+          <w:tcPr/>
+          <w:p>
+            <w:pPr>
+              <w:pStyle w:val="Compact"/>
+              <w:jc w:val="right"/>
+            </w:pPr>
+            <w:r>
+              <w:t xml:space="preserve">qwen2.5:7b (base)</w:t>
+            </w:r>
+          </w:p>
+        </w:tc>
+        <w:tc>
+          <w:tcPr/>
+          <w:p>
+            <w:pPr>
+              <w:pStyle w:val="Compact"/>
+              <w:jc w:val="right"/>
+            </w:pPr>
+            <w:r>
+              <w:t xml:space="preserve">mitre-qwen:7b-v3</w:t>
+            </w:r>
+          </w:p>
+        </w:tc>
+        <w:tc>
+          <w:tcPr/>
+          <w:p>
+            <w:pPr>
+              <w:pStyle w:val="Compact"/>
+              <w:jc w:val="right"/>
+            </w:pPr>
+            <w:r>
+              <w:t xml:space="preserve">Change (v3 vs base)</w:t>
+            </w:r>
+          </w:p>
+        </w:tc>
+      </w:tr>
+      <w:tr>
+        <w:tc>
+          <w:tcPr/>
+          <w:p>
+            <w:pPr>
+              <w:pStyle w:val="Compact"/>
+            </w:pPr>
+            <w:r>
+              <w:t xml:space="preserve">Faithfulness (RAGAS)</w:t>
+            </w:r>
+          </w:p>
+        </w:tc>
+        <w:tc>
+          <w:tcPr/>
+          <w:p>
+            <w:pPr>
+              <w:pStyle w:val="Compact"/>
+              <w:jc w:val="right"/>
+            </w:pPr>
+            <w:r>
+              <w:t xml:space="preserve">0.243</w:t>
+            </w:r>
+          </w:p>
+        </w:tc>
+        <w:tc>
+          <w:tcPr/>
+          <w:p>
+            <w:pPr>
+              <w:pStyle w:val="Compact"/>
+              <w:jc w:val="right"/>
+            </w:pPr>
+            <w:r>
+              <w:rPr>
+                <w:b/>
+                <w:bCs/>
+              </w:rPr>
+              <w:t xml:space="preserve">0.587</w:t>
+            </w:r>
+          </w:p>
+        </w:tc>
+        <w:tc>
+          <w:tcPr/>
+          <w:p>
+            <w:pPr>
+              <w:pStyle w:val="Compact"/>
+              <w:jc w:val="right"/>
+            </w:pPr>
+            <w:r>
+              <w:t xml:space="preserve">+0.344</w:t>
+            </w:r>
+          </w:p>
+        </w:tc>
+      </w:tr>
+      <w:tr>
+        <w:tc>
+          <w:tcPr/>
+          <w:p>
+            <w:pPr>
+              <w:pStyle w:val="Compact"/>
+            </w:pPr>
+            <w:r>
+              <w:t xml:space="preserve">Answer Correctness (RAGAS)</w:t>
+            </w:r>
+          </w:p>
+        </w:tc>
+        <w:tc>
+          <w:tcPr/>
+          <w:p>
+            <w:pPr>
+              <w:pStyle w:val="Compact"/>
+              <w:jc w:val="right"/>
+            </w:pPr>
+            <w:r>
+              <w:rPr>
+                <w:b/>
+                <w:bCs/>
+              </w:rPr>
+              <w:t xml:space="preserve">0.351</w:t>
+            </w:r>
+          </w:p>
+        </w:tc>
+        <w:tc>
+          <w:tcPr/>
+          <w:p>
+            <w:pPr>
+              <w:pStyle w:val="Compact"/>
+              <w:jc w:val="right"/>
+            </w:pPr>
+            <w:r>
+              <w:t xml:space="preserve">0.310</w:t>
+            </w:r>
+          </w:p>
+        </w:tc>
+        <w:tc>
+          <w:tcPr/>
+          <w:p>
+            <w:pPr>
+              <w:pStyle w:val="Compact"/>
+              <w:jc w:val="right"/>
+            </w:pPr>
+            <w:r>
+              <w:t xml:space="preserve">-0.041</w:t>
+            </w:r>
+          </w:p>
+        </w:tc>
+      </w:tr>
+      <w:tr>
+        <w:tc>
+          <w:tcPr/>
+          <w:p>
+            <w:pPr>
+              <w:pStyle w:val="Compact"/>
+            </w:pPr>
+            <w:r>
+              <w:t xml:space="preserve">Token F1</w:t>
+            </w:r>
+          </w:p>
+        </w:tc>
+        <w:tc>
+          <w:tcPr/>
+          <w:p>
+            <w:pPr>
+              <w:pStyle w:val="Compact"/>
+              <w:jc w:val="right"/>
+            </w:pPr>
+            <w:r>
+              <w:t xml:space="preserve">0.131</w:t>
+            </w:r>
+          </w:p>
+        </w:tc>
+        <w:tc>
+          <w:tcPr/>
+          <w:p>
+            <w:pPr>
+              <w:pStyle w:val="Compact"/>
+              <w:jc w:val="right"/>
+            </w:pPr>
+            <w:r>
+              <w:rPr>
+                <w:b/>
+                <w:bCs/>
+              </w:rPr>
+              <w:t xml:space="preserve">0.199</w:t>
+            </w:r>
+          </w:p>
+        </w:tc>
+        <w:tc>
+          <w:tcPr/>
+          <w:p>
+            <w:pPr>
+              <w:pStyle w:val="Compact"/>
+              <w:jc w:val="right"/>
+            </w:pPr>
+            <w:r>
+              <w:t xml:space="preserve">+0.068</w:t>
+            </w:r>
+          </w:p>
+        </w:tc>
+      </w:tr>
+      <w:tr>
+        <w:tc>
+          <w:tcPr/>
+          <w:p>
+            <w:pPr>
+              <w:pStyle w:val="Compact"/>
+            </w:pPr>
+            <w:r>
+              <w:t xml:space="preserve">ROUGE-L</w:t>
+            </w:r>
+          </w:p>
+        </w:tc>
+        <w:tc>
+          <w:tcPr/>
+          <w:p>
+            <w:pPr>
+              <w:pStyle w:val="Compact"/>
+              <w:jc w:val="right"/>
+            </w:pPr>
+            <w:r>
+              <w:t xml:space="preserve">0.082</w:t>
+            </w:r>
+          </w:p>
+        </w:tc>
+        <w:tc>
+          <w:tcPr/>
+          <w:p>
+            <w:pPr>
+              <w:pStyle w:val="Compact"/>
+              <w:jc w:val="right"/>
+            </w:pPr>
+            <w:r>
+              <w:rPr>
+                <w:b/>
+                <w:bCs/>
+              </w:rPr>
+              <w:t xml:space="preserve">0.127</w:t>
+            </w:r>
+          </w:p>
+        </w:tc>
+        <w:tc>
+          <w:tcPr/>
+          <w:p>
+            <w:pPr>
+              <w:pStyle w:val="Compact"/>
+              <w:jc w:val="right"/>
+            </w:pPr>
+            <w:r>
+              <w:t xml:space="preserve">+0.045</w:t>
+            </w:r>
+          </w:p>
+        </w:tc>
+      </w:tr>
+      <w:tr>
+        <w:tc>
+          <w:tcPr/>
+          <w:p>
+            <w:pPr>
+              <w:pStyle w:val="Compact"/>
+            </w:pPr>
+            <w:r>
+              <w:t xml:space="preserve">BERTScore F1</w:t>
+            </w:r>
+          </w:p>
+        </w:tc>
+        <w:tc>
+          <w:tcPr/>
+          <w:p>
+            <w:pPr>
+              <w:pStyle w:val="Compact"/>
+              <w:jc w:val="right"/>
+            </w:pPr>
+            <w:r>
+              <w:t xml:space="preserve">0.826</w:t>
+            </w:r>
+          </w:p>
+        </w:tc>
+        <w:tc>
+          <w:tcPr/>
+          <w:p>
+            <w:pPr>
+              <w:pStyle w:val="Compact"/>
+              <w:jc w:val="right"/>
+            </w:pPr>
+            <w:r>
+              <w:rPr>
+                <w:b/>
+                <w:bCs/>
+              </w:rPr>
+              <w:t xml:space="preserve">0.851</w:t>
+            </w:r>
+          </w:p>
+        </w:tc>
+        <w:tc>
+          <w:tcPr/>
+          <w:p>
+            <w:pPr>
+              <w:pStyle w:val="Compact"/>
+              <w:jc w:val="right"/>
+            </w:pPr>
+            <w:r>
+              <w:t xml:space="preserve">+0.025</w:t>
+            </w:r>
+          </w:p>
+        </w:tc>
+      </w:tr>
+      <w:tr>
+        <w:tc>
+          <w:tcPr/>
+          <w:p>
+            <w:pPr>
+              <w:pStyle w:val="Compact"/>
+            </w:pPr>
+            <w:r>
+              <w:t xml:space="preserve">Avg Latency (ms)</w:t>
+            </w:r>
+          </w:p>
+        </w:tc>
+        <w:tc>
+          <w:tcPr/>
+          <w:p>
+            <w:pPr>
+              <w:pStyle w:val="Compact"/>
+              <w:jc w:val="right"/>
+            </w:pPr>
+            <w:r>
+              <w:t xml:space="preserve">40,765</w:t>
+            </w:r>
+          </w:p>
+        </w:tc>
+        <w:tc>
+          <w:tcPr/>
+          <w:p>
+            <w:pPr>
+              <w:pStyle w:val="Compact"/>
+              <w:jc w:val="right"/>
+            </w:pPr>
+            <w:r>
+              <w:rPr>
+                <w:b/>
+                <w:bCs/>
+              </w:rPr>
+              <w:t xml:space="preserve">35,442</w:t>
+            </w:r>
+          </w:p>
+        </w:tc>
+        <w:tc>
+          <w:tcPr/>
+          <w:p>
+            <w:pPr>
+              <w:pStyle w:val="Compact"/>
+              <w:jc w:val="right"/>
+            </w:pPr>
+            <w:r>
+              <w:t xml:space="preserve">-5,323</w:t>
+            </w:r>
+          </w:p>
+        </w:tc>
+      </w:tr>
+    </w:tbl>
+    <w:p>
+      <w:pPr>
+        <w:pStyle w:val="BodyText"/>
+      </w:pPr>
+      <w:r>
+        <w:rPr>
+          <w:b/>
+          <w:bCs/>
+        </w:rPr>
+        <w:t xml:space="preserve">Finding:</w:t>
+      </w:r>
+      <w:r>
+        <w:t xml:space="preserve"> </w:t>
+      </w:r>
+      <w:r>
+        <w:t xml:space="preserve">v3 matches v1 rather than beating it. Answer Correctness is essentially</w:t>
+      </w:r>
+      <w:r>
+        <w:t xml:space="preserve"> </w:t>
+      </w:r>
+      <w:r>
+        <w:t xml:space="preserve">unchanged (v1 0.305 -&gt; v3 0.310, within judge noise), and v3 trails v1 slightly on</w:t>
+      </w:r>
+      <w:r>
+        <w:t xml:space="preserve"> </w:t>
+      </w:r>
+      <w:r>
+        <w:t xml:space="preserve">lexical overlap (Token F1 0.226 vs 0.199, ROUGE-L 0.150 vs 0.127). The ~0.04</w:t>
+      </w:r>
+      <w:r>
+        <w:t xml:space="preserve"> </w:t>
+      </w:r>
+      <w:r>
+        <w:t xml:space="preserve">Answer-Correctness regression versus base persists in</w:t>
+      </w:r>
+      <w:r>
+        <w:t xml:space="preserve"> </w:t>
+      </w:r>
+      <w:r>
+        <w:rPr>
+          <w:b/>
+          <w:bCs/>
+        </w:rPr>
+        <w:t xml:space="preserve">both</w:t>
+      </w:r>
+      <w:r>
+        <w:t xml:space="preserve"> </w:t>
+      </w:r>
+      <w:r>
+        <w:t xml:space="preserve">v1 and v3 — it is a</w:t>
+      </w:r>
+      <w:r>
+        <w:t xml:space="preserve"> </w:t>
+      </w:r>
+      <w:r>
+        <w:t xml:space="preserve">property of the specialist’s concise, grounded style, not a dataset artefact. The</w:t>
+      </w:r>
+      <w:r>
+        <w:t xml:space="preserve"> </w:t>
+      </w:r>
+      <w:r>
+        <w:t xml:space="preserve">“longer / compound answers”</w:t>
+      </w:r>
+      <w:r>
+        <w:t xml:space="preserve"> </w:t>
+      </w:r>
+      <w:r>
+        <w:t xml:space="preserve">hypothesis for raising Answer Correctness did not hold;</w:t>
+      </w:r>
+      <w:r>
+        <w:t xml:space="preserve"> </w:t>
+      </w:r>
+      <w:r>
+        <w:t xml:space="preserve">a different lever (e.g. distilling richer reference-style answers from a stronger</w:t>
+      </w:r>
+      <w:r>
+        <w:t xml:space="preserve"> </w:t>
+      </w:r>
+      <w:r>
+        <w:t xml:space="preserve">teacher) would be needed.</w:t>
+      </w:r>
+    </w:p>
+    <w:p>
+      <w:r>
+        <w:pict>
+          <v:rect style="width:0;height:1.5pt" o:hralign="center" o:hrstd="t" o:hr="t"/>
+        </w:pict>
+      </w:r>
+    </w:p>
+    <w:bookmarkEnd w:id="35"/>
+    <w:bookmarkEnd w:id="36"/>
+    <w:bookmarkStart w:id="37" w:name="end-to-end-workflow"/>
+    <w:p>
+      <w:pPr>
+        <w:pStyle w:val="Heading1"/>
+      </w:pPr>
+      <w:r>
+        <w:t xml:space="preserve">10. End-to-End Workflow</w:t>
+      </w:r>
+    </w:p>
+    <w:p>
+      <w:pPr>
+        <w:pStyle w:val="SourceCode"/>
+      </w:pPr>
+      <w:r>
+        <w:rPr>
+          <w:rStyle w:val="VerbatimChar"/>
+        </w:rPr>
+        <w:t xml:space="preserve">[1] Build dataset (dev box)</w:t>
+      </w:r>
+      <w:r>
+        <w:br/>
+      </w:r>
+      <w:r>
+        <w:rPr>
+          <w:rStyle w:val="VerbatimChar"/>
+        </w:rPr>
+        <w:t xml:space="preserve">    python data/build_dataset.py --max-per-category 600</w:t>
+      </w:r>
+      <w:r>
+        <w:br/>
+      </w:r>
+      <w:r>
+        <w:rPr>
+          <w:rStyle w:val="VerbatimChar"/>
+        </w:rPr>
+        <w:t xml:space="preserve">        -&gt; data/output/train.jsonl, val.jsonl</w:t>
+      </w:r>
+      <w:r>
+        <w:br/>
+      </w:r>
+      <w:r>
+        <w:br/>
+      </w:r>
+      <w:r>
+        <w:rPr>
+          <w:rStyle w:val="VerbatimChar"/>
+        </w:rPr>
+        <w:t xml:space="preserve">[2] Train (Cloud GPU — Colab/Kaggle T4)</w:t>
+      </w:r>
+      <w:r>
+        <w:br/>
+      </w:r>
+      <w:r>
+        <w:rPr>
+          <w:rStyle w:val="VerbatimChar"/>
+        </w:rPr>
+        <w:t xml:space="preserve">    open train/Finetune_Colab.ipynb  (or: python train/train_unsloth.py --gguf)</w:t>
+      </w:r>
+      <w:r>
+        <w:br/>
+      </w:r>
+      <w:r>
+        <w:rPr>
+          <w:rStyle w:val="VerbatimChar"/>
+        </w:rPr>
+        <w:t xml:space="preserve">        -&gt; LoRA adapter (+ GGUF Q4_K_M)</w:t>
+      </w:r>
+      <w:r>
+        <w:br/>
+      </w:r>
+      <w:r>
+        <w:br/>
+      </w:r>
+      <w:r>
+        <w:rPr>
+          <w:rStyle w:val="VerbatimChar"/>
+        </w:rPr>
+        <w:t xml:space="preserve">[3] Export + register (dev box)</w:t>
+      </w:r>
+      <w:r>
+        <w:br/>
+      </w:r>
+      <w:r>
+        <w:rPr>
+          <w:rStyle w:val="VerbatimChar"/>
+        </w:rPr>
+        <w:t xml:space="preserve">    ollama create mitre-qwen:7b -f export/Modelfile</w:t>
+      </w:r>
+      <w:r>
+        <w:br/>
+      </w:r>
+      <w:r>
+        <w:rPr>
+          <w:rStyle w:val="VerbatimChar"/>
+        </w:rPr>
+        <w:t xml:space="preserve">        -&gt; Ollama now has qwen2.5:7b AND mitre-qwen:7b</w:t>
+      </w:r>
+      <w:r>
+        <w:br/>
+      </w:r>
+      <w:r>
+        <w:br/>
+      </w:r>
+      <w:r>
+        <w:rPr>
+          <w:rStyle w:val="VerbatimChar"/>
+        </w:rPr>
+        <w:t xml:space="preserve">[4] Compare (dev box, DBs up)</w:t>
+      </w:r>
+      <w:r>
+        <w:br/>
+      </w:r>
+      <w:r>
+        <w:rPr>
+          <w:rStyle w:val="VerbatimChar"/>
+        </w:rPr>
+        <w:t xml:space="preserve">    python compare/run_comparison.py --max-samples 20</w:t>
+      </w:r>
+      <w:r>
+        <w:br/>
+      </w:r>
+      <w:r>
+        <w:rPr>
+          <w:rStyle w:val="VerbatimChar"/>
+        </w:rPr>
+        <w:t xml:space="preserve">        -&gt; compare/comparison_&lt;dataset&gt;.md  (side-by-side metrics)</w:t>
+      </w:r>
+    </w:p>
+    <w:p>
+      <w:r>
+        <w:pict>
+          <v:rect style="width:0;height:1.5pt" o:hralign="center" o:hrstd="t" o:hr="t"/>
+        </w:pict>
+      </w:r>
+    </w:p>
+    <w:bookmarkEnd w:id="37"/>
+    <w:bookmarkStart w:id="38" w:name="reproducibility"/>
+    <w:p>
+      <w:pPr>
+        <w:pStyle w:val="Heading1"/>
+      </w:pPr>
+      <w:r>
+        <w:t xml:space="preserve">11. Reproducibility</w:t>
       </w:r>
     </w:p>
     <w:p>
@@ -5309,11 +5909,21 @@
         <w:pStyle w:val="Compact"/>
         <w:numPr>
           <w:ilvl w:val="0"/>
-          <w:numId w:val="1010"/>
+          <w:numId w:val="1011"/>
         </w:numPr>
       </w:pPr>
       <w:r>
-        <w:t xml:space="preserve">Dataset is regenerable from versioned STIX bundles (Enterprise/Mobile v19.0).</w:t>
+        <w:rPr>
+          <w:b/>
+          <w:bCs/>
+        </w:rPr>
+        <w:t xml:space="preserve">Seed</w:t>
+      </w:r>
+      <w:r>
+        <w:t xml:space="preserve"> </w:t>
+      </w:r>
+      <w:r>
+        <w:t xml:space="preserve">42 used for dataset shuffling/splitting and training.</w:t>
       </w:r>
     </w:p>
     <w:p>
@@ -5321,26 +5931,23 @@
         <w:pStyle w:val="Compact"/>
         <w:numPr>
           <w:ilvl w:val="0"/>
-          <w:numId w:val="1010"/>
+          <w:numId w:val="1011"/>
         </w:numPr>
       </w:pPr>
       <w:r>
-        <w:t xml:space="preserve">The Colab notebook pins the install and clones the exact branch</w:t>
-      </w:r>
-      <w:r>
-        <w:t xml:space="preserve"> </w:t>
-      </w:r>
-      <w:r>
-        <w:t xml:space="preserve">(</w:t>
+        <w:t xml:space="preserve">All hyper-parameters are centralised in</w:t>
+      </w:r>
+      <w:r>
+        <w:t xml:space="preserve"> </w:t>
       </w:r>
       <w:r>
         <w:rPr>
           <w:rStyle w:val="VerbatimChar"/>
         </w:rPr>
-        <w:t xml:space="preserve">feat/finetune-mitre-specialist</w:t>
-      </w:r>
-      <w:r>
-        <w:t xml:space="preserve">).</w:t>
+        <w:t xml:space="preserve">ft_config.py</w:t>
+      </w:r>
+      <w:r>
+        <w:t xml:space="preserve">.</w:t>
       </w:r>
     </w:p>
     <w:p>
@@ -5348,7 +5955,46 @@
         <w:pStyle w:val="Compact"/>
         <w:numPr>
           <w:ilvl w:val="0"/>
-          <w:numId w:val="1010"/>
+          <w:numId w:val="1011"/>
+        </w:numPr>
+      </w:pPr>
+      <w:r>
+        <w:t xml:space="preserve">Dataset is regenerable from versioned STIX bundles (Enterprise/Mobile v19.0).</w:t>
+      </w:r>
+    </w:p>
+    <w:p>
+      <w:pPr>
+        <w:pStyle w:val="Compact"/>
+        <w:numPr>
+          <w:ilvl w:val="0"/>
+          <w:numId w:val="1011"/>
+        </w:numPr>
+      </w:pPr>
+      <w:r>
+        <w:t xml:space="preserve">The Colab notebook pins the install and clones the exact branch</w:t>
+      </w:r>
+      <w:r>
+        <w:t xml:space="preserve"> </w:t>
+      </w:r>
+      <w:r>
+        <w:t xml:space="preserve">(</w:t>
+      </w:r>
+      <w:r>
+        <w:rPr>
+          <w:rStyle w:val="VerbatimChar"/>
+        </w:rPr>
+        <w:t xml:space="preserve">feat/finetune-mitre-specialist</w:t>
+      </w:r>
+      <w:r>
+        <w:t xml:space="preserve">).</w:t>
+      </w:r>
+    </w:p>
+    <w:p>
+      <w:pPr>
+        <w:pStyle w:val="Compact"/>
+        <w:numPr>
+          <w:ilvl w:val="0"/>
+          <w:numId w:val="1011"/>
         </w:numPr>
       </w:pPr>
       <w:r>
@@ -5638,245 +6284,14 @@
         </w:pict>
       </w:r>
     </w:p>
-    <w:bookmarkEnd w:id="37"/>
-    <w:bookmarkStart w:id="38" w:name="limitations-and-future-work"/>
+    <w:bookmarkEnd w:id="38"/>
+    <w:bookmarkStart w:id="39" w:name="limitations-and-future-work"/>
     <w:p>
       <w:pPr>
         <w:pStyle w:val="Heading1"/>
       </w:pPr>
       <w:r>
         <w:t xml:space="preserve">12. Limitations and Future Work</w:t>
-      </w:r>
-    </w:p>
-    <w:p>
-      <w:pPr>
-        <w:pStyle w:val="Compact"/>
-        <w:numPr>
-          <w:ilvl w:val="0"/>
-          <w:numId w:val="1011"/>
-        </w:numPr>
-      </w:pPr>
-      <w:r>
-        <w:rPr>
-          <w:b/>
-          <w:bCs/>
-        </w:rPr>
-        <w:t xml:space="preserve">Template-generated answers</w:t>
-      </w:r>
-      <w:r>
-        <w:t xml:space="preserve"> </w:t>
-      </w:r>
-      <w:r>
-        <w:t xml:space="preserve">are factually grounded but stylistically</w:t>
-      </w:r>
-      <w:r>
-        <w:t xml:space="preserve"> </w:t>
-      </w:r>
-      <w:r>
-        <w:t xml:space="preserve">uniform. A future iteration could distil richer, incident-style answers from a</w:t>
-      </w:r>
-      <w:r>
-        <w:t xml:space="preserve"> </w:t>
-      </w:r>
-      <w:r>
-        <w:t xml:space="preserve">stronger teacher model (e.g. Claude) for the four-section incident format used</w:t>
-      </w:r>
-      <w:r>
-        <w:t xml:space="preserve"> </w:t>
-      </w:r>
-      <w:r>
-        <w:t xml:space="preserve">by the pipeline’s</w:t>
-      </w:r>
-      <w:r>
-        <w:t xml:space="preserve"> </w:t>
-      </w:r>
-      <w:r>
-        <w:rPr>
-          <w:rStyle w:val="VerbatimChar"/>
-        </w:rPr>
-        <w:t xml:space="preserve">REASONING_SYSTEM_PROMPT</w:t>
-      </w:r>
-      <w:r>
-        <w:t xml:space="preserve">.</w:t>
-      </w:r>
-    </w:p>
-    <w:p>
-      <w:pPr>
-        <w:pStyle w:val="Compact"/>
-        <w:numPr>
-          <w:ilvl w:val="0"/>
-          <w:numId w:val="1011"/>
-        </w:numPr>
-      </w:pPr>
-      <w:r>
-        <w:rPr>
-          <w:b/>
-          <w:bCs/>
-        </w:rPr>
-        <w:t xml:space="preserve">No</w:t>
-      </w:r>
-      <w:r>
-        <w:rPr>
-          <w:b/>
-          <w:bCs/>
-        </w:rPr>
-        <w:t xml:space="preserve"> </w:t>
-      </w:r>
-      <w:r>
-        <w:rPr>
-          <w:rStyle w:val="VerbatimChar"/>
-          <w:b/>
-          <w:bCs/>
-        </w:rPr>
-        <w:t xml:space="preserve">technique_detection</w:t>
-      </w:r>
-      <w:r>
-        <w:t xml:space="preserve"> </w:t>
-      </w:r>
-      <w:r>
-        <w:t xml:space="preserve">examples because the current STIX export lacks</w:t>
-      </w:r>
-      <w:r>
-        <w:t xml:space="preserve"> </w:t>
-      </w:r>
-      <w:r>
-        <w:rPr>
-          <w:rStyle w:val="VerbatimChar"/>
-        </w:rPr>
-        <w:t xml:space="preserve">detects</w:t>
-      </w:r>
-      <w:r>
-        <w:t xml:space="preserve"> </w:t>
-      </w:r>
-      <w:r>
-        <w:t xml:space="preserve">edges; adding detection data sources would broaden coverage.</w:t>
-      </w:r>
-    </w:p>
-    <w:p>
-      <w:pPr>
-        <w:pStyle w:val="Compact"/>
-        <w:numPr>
-          <w:ilvl w:val="0"/>
-          <w:numId w:val="1011"/>
-        </w:numPr>
-      </w:pPr>
-      <w:r>
-        <w:rPr>
-          <w:b/>
-          <w:bCs/>
-        </w:rPr>
-        <w:t xml:space="preserve">Default in-domain evaluation</w:t>
-      </w:r>
-      <w:r>
-        <w:t xml:space="preserve"> </w:t>
-      </w:r>
-      <w:r>
-        <w:t xml:space="preserve">— for a strict generalisation claim, rebuild</w:t>
-      </w:r>
-      <w:r>
-        <w:t xml:space="preserve"> </w:t>
-      </w:r>
-      <w:r>
-        <w:t xml:space="preserve">with</w:t>
-      </w:r>
-      <w:r>
-        <w:t xml:space="preserve"> </w:t>
-      </w:r>
-      <w:r>
-        <w:rPr>
-          <w:rStyle w:val="VerbatimChar"/>
-        </w:rPr>
-        <w:t xml:space="preserve">--holdout ids</w:t>
-      </w:r>
-      <w:r>
-        <w:t xml:space="preserve"> </w:t>
-      </w:r>
-      <w:r>
-        <w:t xml:space="preserve">and report that number separately.</w:t>
-      </w:r>
-    </w:p>
-    <w:p>
-      <w:pPr>
-        <w:pStyle w:val="Compact"/>
-        <w:numPr>
-          <w:ilvl w:val="0"/>
-          <w:numId w:val="1011"/>
-        </w:numPr>
-      </w:pPr>
-      <w:r>
-        <w:rPr>
-          <w:b/>
-          <w:bCs/>
-        </w:rPr>
-        <w:t xml:space="preserve">Single quantisation</w:t>
-      </w:r>
-      <w:r>
-        <w:t xml:space="preserve"> </w:t>
-      </w:r>
-      <w:r>
-        <w:t xml:space="preserve">(Q4_K_M) is exported; higher-fidelity variants</w:t>
-      </w:r>
-      <w:r>
-        <w:t xml:space="preserve"> </w:t>
-      </w:r>
-      <w:r>
-        <w:t xml:space="preserve">(Q5_K_M / Q8_0) could be compared for the quality/size trade-off.</w:t>
-      </w:r>
-    </w:p>
-    <w:p>
-      <w:pPr>
-        <w:pStyle w:val="Compact"/>
-        <w:numPr>
-          <w:ilvl w:val="0"/>
-          <w:numId w:val="1011"/>
-        </w:numPr>
-      </w:pPr>
-      <w:r>
-        <w:t xml:space="preserve">A LoRA over the instruct base preserves general ability, so the specialist also</w:t>
-      </w:r>
-      <w:r>
-        <w:t xml:space="preserve"> </w:t>
-      </w:r>
-      <w:r>
-        <w:t xml:space="preserve">serves the pipeline’s translation/routing roles in</w:t>
-      </w:r>
-      <w:r>
-        <w:t xml:space="preserve"> </w:t>
-      </w:r>
-      <w:r>
-        <w:rPr>
-          <w:rStyle w:val="VerbatimChar"/>
-        </w:rPr>
-        <w:t xml:space="preserve">--local</w:t>
-      </w:r>
-      <w:r>
-        <w:t xml:space="preserve"> </w:t>
-      </w:r>
-      <w:r>
-        <w:t xml:space="preserve">mode; a dedicated</w:t>
-      </w:r>
-      <w:r>
-        <w:t xml:space="preserve"> </w:t>
-      </w:r>
-      <w:r>
-        <w:t xml:space="preserve">evaluation of those secondary roles is left as future work.</w:t>
-      </w:r>
-    </w:p>
-    <w:p>
-      <w:r>
-        <w:pict>
-          <v:rect style="width:0;height:1.5pt" o:hralign="center" o:hrstd="t" o:hr="t"/>
-        </w:pict>
-      </w:r>
-    </w:p>
-    <w:bookmarkEnd w:id="38"/>
-    <w:bookmarkStart w:id="39" w:name="appendix-a-glossary"/>
-    <w:p>
-      <w:pPr>
-        <w:pStyle w:val="Heading1"/>
-      </w:pPr>
-      <w:r>
-        <w:t xml:space="preserve">Appendix A — Glossary</w:t>
       </w:r>
     </w:p>
     <w:p>
@@ -5892,13 +6307,43 @@
           <w:b/>
           <w:bCs/>
         </w:rPr>
-        <w:t xml:space="preserve">LoRA</w:t>
-      </w:r>
-      <w:r>
-        <w:t xml:space="preserve"> </w:t>
-      </w:r>
-      <w:r>
-        <w:t xml:space="preserve">— Low-Rank Adaptation; trains small adapter matrices on a frozen model.</w:t>
+        <w:t xml:space="preserve">Template-generated answers</w:t>
+      </w:r>
+      <w:r>
+        <w:t xml:space="preserve"> </w:t>
+      </w:r>
+      <w:r>
+        <w:t xml:space="preserve">are factually grounded but stylistically</w:t>
+      </w:r>
+      <w:r>
+        <w:t xml:space="preserve"> </w:t>
+      </w:r>
+      <w:r>
+        <w:t xml:space="preserve">uniform. A future iteration could distil richer, incident-style answers from a</w:t>
+      </w:r>
+      <w:r>
+        <w:t xml:space="preserve"> </w:t>
+      </w:r>
+      <w:r>
+        <w:t xml:space="preserve">stronger teacher model (e.g. Claude) for the four-section incident format used</w:t>
+      </w:r>
+      <w:r>
+        <w:t xml:space="preserve"> </w:t>
+      </w:r>
+      <w:r>
+        <w:t xml:space="preserve">by the pipeline’s</w:t>
+      </w:r>
+      <w:r>
+        <w:t xml:space="preserve"> </w:t>
+      </w:r>
+      <w:r>
+        <w:rPr>
+          <w:rStyle w:val="VerbatimChar"/>
+        </w:rPr>
+        <w:t xml:space="preserve">REASONING_SYSTEM_PROMPT</w:t>
+      </w:r>
+      <w:r>
+        <w:t xml:space="preserve">.</w:t>
       </w:r>
     </w:p>
     <w:p>
@@ -5914,13 +6359,43 @@
           <w:b/>
           <w:bCs/>
         </w:rPr>
-        <w:t xml:space="preserve">QLoRA</w:t>
-      </w:r>
-      <w:r>
-        <w:t xml:space="preserve"> </w:t>
-      </w:r>
-      <w:r>
-        <w:t xml:space="preserve">— LoRA on a 4-bit quantised base model.</w:t>
+        <w:t xml:space="preserve">No</w:t>
+      </w:r>
+      <w:r>
+        <w:rPr>
+          <w:b/>
+          <w:bCs/>
+        </w:rPr>
+        <w:t xml:space="preserve"> </w:t>
+      </w:r>
+      <w:r>
+        <w:rPr>
+          <w:rStyle w:val="VerbatimChar"/>
+          <w:b/>
+          <w:bCs/>
+        </w:rPr>
+        <w:t xml:space="preserve">technique_detection</w:t>
+      </w:r>
+      <w:r>
+        <w:t xml:space="preserve"> </w:t>
+      </w:r>
+      <w:r>
+        <w:t xml:space="preserve">examples because the current STIX export lacks</w:t>
+      </w:r>
+      <w:r>
+        <w:t xml:space="preserve"> </w:t>
+      </w:r>
+      <w:r>
+        <w:rPr>
+          <w:rStyle w:val="VerbatimChar"/>
+        </w:rPr>
+        <w:t xml:space="preserve">detects</w:t>
+      </w:r>
+      <w:r>
+        <w:t xml:space="preserve"> </w:t>
+      </w:r>
+      <w:r>
+        <w:t xml:space="preserve">edges; adding detection data sources would broaden coverage.</w:t>
       </w:r>
     </w:p>
     <w:p>
@@ -5936,13 +6411,34 @@
           <w:b/>
           <w:bCs/>
         </w:rPr>
-        <w:t xml:space="preserve">Adapter</w:t>
-      </w:r>
-      <w:r>
-        <w:t xml:space="preserve"> </w:t>
-      </w:r>
-      <w:r>
-        <w:t xml:space="preserve">— the small trained weights produced by LoRA.</w:t>
+        <w:t xml:space="preserve">Default in-domain evaluation</w:t>
+      </w:r>
+      <w:r>
+        <w:t xml:space="preserve"> </w:t>
+      </w:r>
+      <w:r>
+        <w:t xml:space="preserve">— for a strict generalisation claim, rebuild</w:t>
+      </w:r>
+      <w:r>
+        <w:t xml:space="preserve"> </w:t>
+      </w:r>
+      <w:r>
+        <w:t xml:space="preserve">with</w:t>
+      </w:r>
+      <w:r>
+        <w:t xml:space="preserve"> </w:t>
+      </w:r>
+      <w:r>
+        <w:rPr>
+          <w:rStyle w:val="VerbatimChar"/>
+        </w:rPr>
+        <w:t xml:space="preserve">--holdout ids</w:t>
+      </w:r>
+      <w:r>
+        <w:t xml:space="preserve"> </w:t>
+      </w:r>
+      <w:r>
+        <w:t xml:space="preserve">and report that number separately.</w:t>
       </w:r>
     </w:p>
     <w:p>
@@ -5958,13 +6454,19 @@
           <w:b/>
           <w:bCs/>
         </w:rPr>
-        <w:t xml:space="preserve">GGUF</w:t>
-      </w:r>
-      <w:r>
-        <w:t xml:space="preserve"> </w:t>
-      </w:r>
-      <w:r>
-        <w:t xml:space="preserve">— the file format used by llama.cpp / Ollama for quantised models.</w:t>
+        <w:t xml:space="preserve">Single quantisation</w:t>
+      </w:r>
+      <w:r>
+        <w:t xml:space="preserve"> </w:t>
+      </w:r>
+      <w:r>
+        <w:t xml:space="preserve">(Q4_K_M) is exported; higher-fidelity variants</w:t>
+      </w:r>
+      <w:r>
+        <w:t xml:space="preserve"> </w:t>
+      </w:r>
+      <w:r>
+        <w:t xml:space="preserve">(Q5_K_M / Q8_0) could be compared for the quality/size trade-off.</w:t>
       </w:r>
     </w:p>
     <w:p>
@@ -5976,17 +6478,51 @@
         </w:numPr>
       </w:pPr>
       <w:r>
-        <w:rPr>
-          <w:b/>
-          <w:bCs/>
-        </w:rPr>
-        <w:t xml:space="preserve">Q4_K_M</w:t>
-      </w:r>
-      <w:r>
-        <w:t xml:space="preserve"> </w:t>
-      </w:r>
-      <w:r>
-        <w:t xml:space="preserve">— a 4-bit k-quant GGUF variant balancing size and quality.</w:t>
+        <w:t xml:space="preserve">A LoRA over the instruct base preserves general ability, so the specialist also</w:t>
+      </w:r>
+      <w:r>
+        <w:t xml:space="preserve"> </w:t>
+      </w:r>
+      <w:r>
+        <w:t xml:space="preserve">serves the pipeline’s translation/routing roles in</w:t>
+      </w:r>
+      <w:r>
+        <w:t xml:space="preserve"> </w:t>
+      </w:r>
+      <w:r>
+        <w:rPr>
+          <w:rStyle w:val="VerbatimChar"/>
+        </w:rPr>
+        <w:t xml:space="preserve">--local</w:t>
+      </w:r>
+      <w:r>
+        <w:t xml:space="preserve"> </w:t>
+      </w:r>
+      <w:r>
+        <w:t xml:space="preserve">mode; a dedicated</w:t>
+      </w:r>
+      <w:r>
+        <w:t xml:space="preserve"> </w:t>
+      </w:r>
+      <w:r>
+        <w:t xml:space="preserve">evaluation of those secondary roles is left as future work.</w:t>
+      </w:r>
+    </w:p>
+    <w:p>
+      <w:r>
+        <w:pict>
+          <v:rect style="width:0;height:1.5pt" o:hralign="center" o:hrstd="t" o:hr="t"/>
+        </w:pict>
+      </w:r>
+    </w:p>
+    <w:bookmarkEnd w:id="39"/>
+    <w:bookmarkStart w:id="40" w:name="appendix-a-glossary"/>
+    <w:p>
+      <w:pPr>
+        <w:pStyle w:val="Heading1"/>
+      </w:pPr>
+      <w:r>
+        <w:t xml:space="preserve">Appendix A — Glossary</w:t>
       </w:r>
     </w:p>
     <w:p>
@@ -5994,7 +6530,7 @@
         <w:pStyle w:val="Compact"/>
         <w:numPr>
           <w:ilvl w:val="0"/>
-          <w:numId w:val="1012"/>
+          <w:numId w:val="1013"/>
         </w:numPr>
       </w:pPr>
       <w:r>
@@ -6002,25 +6538,13 @@
           <w:b/>
           <w:bCs/>
         </w:rPr>
-        <w:t xml:space="preserve">ChatML</w:t>
-      </w:r>
-      <w:r>
-        <w:t xml:space="preserve"> </w:t>
-      </w:r>
-      <w:r>
-        <w:t xml:space="preserve">— the chat template format used by Qwen2.5 (</w:t>
-      </w:r>
-      <w:r>
-        <w:rPr>
-          <w:rStyle w:val="VerbatimChar"/>
-        </w:rPr>
-        <w:t xml:space="preserve">&lt;|im_start|&gt;</w:t>
-      </w:r>
-      <w:r>
-        <w:t xml:space="preserve"> </w:t>
-      </w:r>
-      <w:r>
-        <w:t xml:space="preserve">markers).</w:t>
+        <w:t xml:space="preserve">LoRA</w:t>
+      </w:r>
+      <w:r>
+        <w:t xml:space="preserve"> </w:t>
+      </w:r>
+      <w:r>
+        <w:t xml:space="preserve">— Low-Rank Adaptation; trains small adapter matrices on a frozen model.</w:t>
       </w:r>
     </w:p>
     <w:p>
@@ -6028,7 +6552,7 @@
         <w:pStyle w:val="Compact"/>
         <w:numPr>
           <w:ilvl w:val="0"/>
-          <w:numId w:val="1012"/>
+          <w:numId w:val="1013"/>
         </w:numPr>
       </w:pPr>
       <w:r>
@@ -6036,6 +6560,128 @@
           <w:b/>
           <w:bCs/>
         </w:rPr>
+        <w:t xml:space="preserve">QLoRA</w:t>
+      </w:r>
+      <w:r>
+        <w:t xml:space="preserve"> </w:t>
+      </w:r>
+      <w:r>
+        <w:t xml:space="preserve">— LoRA on a 4-bit quantised base model.</w:t>
+      </w:r>
+    </w:p>
+    <w:p>
+      <w:pPr>
+        <w:pStyle w:val="Compact"/>
+        <w:numPr>
+          <w:ilvl w:val="0"/>
+          <w:numId w:val="1013"/>
+        </w:numPr>
+      </w:pPr>
+      <w:r>
+        <w:rPr>
+          <w:b/>
+          <w:bCs/>
+        </w:rPr>
+        <w:t xml:space="preserve">Adapter</w:t>
+      </w:r>
+      <w:r>
+        <w:t xml:space="preserve"> </w:t>
+      </w:r>
+      <w:r>
+        <w:t xml:space="preserve">— the small trained weights produced by LoRA.</w:t>
+      </w:r>
+    </w:p>
+    <w:p>
+      <w:pPr>
+        <w:pStyle w:val="Compact"/>
+        <w:numPr>
+          <w:ilvl w:val="0"/>
+          <w:numId w:val="1013"/>
+        </w:numPr>
+      </w:pPr>
+      <w:r>
+        <w:rPr>
+          <w:b/>
+          <w:bCs/>
+        </w:rPr>
+        <w:t xml:space="preserve">GGUF</w:t>
+      </w:r>
+      <w:r>
+        <w:t xml:space="preserve"> </w:t>
+      </w:r>
+      <w:r>
+        <w:t xml:space="preserve">— the file format used by llama.cpp / Ollama for quantised models.</w:t>
+      </w:r>
+    </w:p>
+    <w:p>
+      <w:pPr>
+        <w:pStyle w:val="Compact"/>
+        <w:numPr>
+          <w:ilvl w:val="0"/>
+          <w:numId w:val="1013"/>
+        </w:numPr>
+      </w:pPr>
+      <w:r>
+        <w:rPr>
+          <w:b/>
+          <w:bCs/>
+        </w:rPr>
+        <w:t xml:space="preserve">Q4_K_M</w:t>
+      </w:r>
+      <w:r>
+        <w:t xml:space="preserve"> </w:t>
+      </w:r>
+      <w:r>
+        <w:t xml:space="preserve">— a 4-bit k-quant GGUF variant balancing size and quality.</w:t>
+      </w:r>
+    </w:p>
+    <w:p>
+      <w:pPr>
+        <w:pStyle w:val="Compact"/>
+        <w:numPr>
+          <w:ilvl w:val="0"/>
+          <w:numId w:val="1013"/>
+        </w:numPr>
+      </w:pPr>
+      <w:r>
+        <w:rPr>
+          <w:b/>
+          <w:bCs/>
+        </w:rPr>
+        <w:t xml:space="preserve">ChatML</w:t>
+      </w:r>
+      <w:r>
+        <w:t xml:space="preserve"> </w:t>
+      </w:r>
+      <w:r>
+        <w:t xml:space="preserve">— the chat template format used by Qwen2.5 (</w:t>
+      </w:r>
+      <w:r>
+        <w:rPr>
+          <w:rStyle w:val="VerbatimChar"/>
+        </w:rPr>
+        <w:t xml:space="preserve">&lt;|im_start|&gt;</w:t>
+      </w:r>
+      <w:r>
+        <w:t xml:space="preserve"> </w:t>
+      </w:r>
+      <w:r>
+        <w:t xml:space="preserve">markers).</w:t>
+      </w:r>
+    </w:p>
+    <w:p>
+      <w:pPr>
+        <w:pStyle w:val="Compact"/>
+        <w:numPr>
+          <w:ilvl w:val="0"/>
+          <w:numId w:val="1013"/>
+        </w:numPr>
+      </w:pPr>
+      <w:r>
+        <w:rPr>
+          <w:b/>
+          <w:bCs/>
+        </w:rPr>
         <w:t xml:space="preserve">RAGAS</w:t>
       </w:r>
       <w:r>
@@ -6045,7 +6691,7 @@
         <w:t xml:space="preserve">— a library of LLM-based RAG evaluation metrics.</w:t>
       </w:r>
     </w:p>
-    <w:bookmarkEnd w:id="39"/>
+    <w:bookmarkEnd w:id="40"/>
     <w:sectPr>
       <w:footnotePr>
         <w:numRestart w:val="eachSect"/>
@@ -6435,6 +7081,9 @@
     <w:abstractNumId w:val="991"/>
   </w:num>
   <w:num w:numId="1012">
+    <w:abstractNumId w:val="991"/>
+  </w:num>
+  <w:num w:numId="1013">
     <w:abstractNumId w:val="991"/>
   </w:num>
 </w:numbering>

</xml_diff>